<commit_message>
docs: document per-brand/segment appendix in user guides
Add "tạo appendix riêng cho từng brand" to USER_GUIDE.md,
CLAUDE_CHAT_GUIDE.md (+ its build_guide.js docx source), covering the
table-level filter + is_appendix workflow: multiple brand tables merge
into one PPTX, each brand as its own PowerPoint Section, with Claude
asking which table(s) to run when the choice isn't saved yet.

Co-Authored-By: Claude Sonnet 5 <noreply@anthropic.com>
</commit_message>
<xml_diff>
--- a/docs/CLAUDE_CHAT_GUIDE.docx
+++ b/docs/CLAUDE_CHAT_GUIDE.docx
@@ -3910,6 +3910,213 @@
     </w:p>
     <w:p>
       <w:pPr>
+        <w:spacing w:after="80"/>
+      </w:pPr>
+    </w:p>
+    <w:p>
+      <w:pPr>
+        <w:pStyle w:val="Heading2"/>
+        <w:pBdr>
+          <w:bottom w:val="single" w:color="2E75B6" w:sz="6" w:space="2"/>
+        </w:pBdr>
+        <w:spacing w:after="120" w:before="280"/>
+      </w:pPr>
+      <w:r>
+        <w:rPr>
+          <w:rFonts w:ascii="Arial" w:cs="Arial" w:eastAsia="Arial" w:hAnsi="Arial"/>
+          <w:b/>
+          <w:bCs/>
+          <w:color w:val="2E75B6"/>
+          <w:sz w:val="26"/>
+          <w:szCs w:val="26"/>
+        </w:rPr>
+        <w:t xml:space="preserve">Tạo appendix riêng theo từng brand/nhãn hàng</w:t>
+      </w:r>
+    </w:p>
+    <w:tbl>
+      <w:tblPr>
+        <w:tblW w:type="dxa" w:w="13954"/>
+        <w:tblBorders>
+          <w:top w:val="single" w:color="auto" w:sz="4"/>
+          <w:left w:val="single" w:color="auto" w:sz="4"/>
+          <w:bottom w:val="single" w:color="auto" w:sz="4"/>
+          <w:right w:val="single" w:color="auto" w:sz="4"/>
+          <w:insideH w:val="single" w:color="auto" w:sz="4"/>
+          <w:insideV w:val="single" w:color="auto" w:sz="4"/>
+        </w:tblBorders>
+      </w:tblPr>
+      <w:tblGrid>
+        <w:gridCol w:w="13954"/>
+      </w:tblGrid>
+      <w:tr>
+        <w:tc>
+          <w:tcPr>
+            <w:tcW w:type="dxa" w:w="13954"/>
+            <w:tcBorders>
+              <w:top w:val="single" w:color="AAAAAA" w:sz="4"/>
+              <w:left w:val="single" w:color="AAAAAA" w:sz="4"/>
+              <w:bottom w:val="single" w:color="AAAAAA" w:sz="4"/>
+              <w:right w:val="single" w:color="AAAAAA" w:sz="4"/>
+            </w:tcBorders>
+            <w:shd w:fill="F2F2F2" w:val="clear"/>
+            <w:tcMar>
+              <w:top w:type="dxa" w:w="120"/>
+              <w:left w:type="dxa" w:w="220"/>
+              <w:bottom w:type="dxa" w:w="120"/>
+              <w:right w:type="dxa" w:w="220"/>
+            </w:tcMar>
+          </w:tcPr>
+          <w:p>
+            <w:pPr>
+              <w:spacing w:after="40"/>
+            </w:pPr>
+            <w:r>
+              <w:rPr>
+                <w:rFonts w:ascii="Courier New" w:cs="Courier New" w:eastAsia="Courier New" w:hAnsi="Courier New"/>
+                <w:color w:val="333333"/>
+                <w:sz w:val="20"/>
+                <w:szCs w:val="20"/>
+              </w:rPr>
+              <w:t xml:space="preserve">Tạo appendix riêng cho từng brand</w:t>
+            </w:r>
+          </w:p>
+          <w:p>
+            <w:pPr>
+              <w:spacing w:after="0"/>
+            </w:pPr>
+            <w:r>
+              <w:rPr>
+                <w:rFonts w:ascii="Courier New" w:cs="Courier New" w:eastAsia="Courier New" w:hAnsi="Courier New"/>
+                <w:color w:val="333333"/>
+                <w:sz w:val="20"/>
+                <w:szCs w:val="20"/>
+              </w:rPr>
+              <w:t xml:space="preserve">Base của bảng Hảo Hảo chỉ tính người chọn Hảo Hảo ở Q2</w:t>
+            </w:r>
+          </w:p>
+        </w:tc>
+      </w:tr>
+    </w:tbl>
+    <w:p>
+      <w:pPr>
+        <w:spacing w:after="80"/>
+      </w:pPr>
+    </w:p>
+    <w:p>
+      <w:pPr>
+        <w:spacing w:after="120"/>
+      </w:pPr>
+      <w:r>
+        <w:rPr>
+          <w:rFonts w:ascii="Arial" w:cs="Arial" w:eastAsia="Arial" w:hAnsi="Arial"/>
+          <w:sz w:val="22"/>
+          <w:szCs w:val="22"/>
+        </w:rPr>
+        <w:t xml:space="preserve">Claude gộp tất cả brand vào 1 file PPTX, mỗi brand là 1 Section riêng trong PowerPoint (Slide Sorter/Outline view) để dễ nhảy nhanh giữa các brand khi review — không tốn thêm slide chia trang.</w:t>
+      </w:r>
+    </w:p>
+    <w:p>
+      <w:pPr>
+        <w:spacing w:after="80"/>
+      </w:pPr>
+    </w:p>
+    <w:p>
+      <w:pPr>
+        <w:spacing w:after="120"/>
+      </w:pPr>
+      <w:r>
+        <w:rPr>
+          <w:rFonts w:ascii="Arial" w:cs="Arial" w:eastAsia="Arial" w:hAnsi="Arial"/>
+          <w:sz w:val="22"/>
+          <w:szCs w:val="22"/>
+        </w:rPr>
+        <w:t xml:space="preserve">Nếu có nhiều bảng mà chưa rõ chạy bảng nào, Claude hỏi:</w:t>
+      </w:r>
+    </w:p>
+    <w:p>
+      <w:pPr>
+        <w:spacing w:after="60"/>
+      </w:pPr>
+    </w:p>
+    <w:tbl>
+      <w:tblPr>
+        <w:tblW w:type="dxa" w:w="13954"/>
+        <w:tblBorders>
+          <w:top w:val="single" w:color="auto" w:sz="4"/>
+          <w:left w:val="single" w:color="auto" w:sz="4"/>
+          <w:bottom w:val="single" w:color="auto" w:sz="4"/>
+          <w:right w:val="single" w:color="auto" w:sz="4"/>
+          <w:insideH w:val="single" w:color="auto" w:sz="4"/>
+          <w:insideV w:val="single" w:color="auto" w:sz="4"/>
+        </w:tblBorders>
+      </w:tblPr>
+      <w:tblGrid>
+        <w:gridCol w:w="13954"/>
+      </w:tblGrid>
+      <w:tr>
+        <w:tc>
+          <w:tcPr>
+            <w:tcW w:type="dxa" w:w="13954"/>
+            <w:tcBorders>
+              <w:top w:val="single" w:color="A0BFE0" w:sz="4"/>
+              <w:left w:val="single" w:color="A0BFE0" w:sz="4"/>
+              <w:bottom w:val="single" w:color="A0BFE0" w:sz="4"/>
+              <w:right w:val="single" w:color="A0BFE0" w:sz="4"/>
+            </w:tcBorders>
+            <w:shd w:fill="D6E4F3" w:val="clear"/>
+            <w:tcMar>
+              <w:top w:type="dxa" w:w="120"/>
+              <w:left w:type="dxa" w:w="200"/>
+              <w:bottom w:type="dxa" w:w="120"/>
+              <w:right w:type="dxa" w:w="200"/>
+            </w:tcMar>
+          </w:tcPr>
+          <w:p>
+            <w:pPr>
+              <w:spacing w:after="0"/>
+            </w:pPr>
+            <w:r>
+              <w:rPr>
+                <w:rFonts w:ascii="Segoe UI Emoji" w:cs="Segoe UI Emoji" w:eastAsia="Segoe UI Emoji" w:hAnsi="Segoe UI Emoji"/>
+                <w:sz w:val="22"/>
+                <w:szCs w:val="22"/>
+              </w:rPr>
+              <w:t xml:space="preserve">🤖  </w:t>
+            </w:r>
+            <w:r>
+              <w:rPr>
+                <w:rFonts w:ascii="Arial" w:cs="Arial" w:eastAsia="Arial" w:hAnsi="Arial"/>
+                <w:i/>
+                <w:iCs/>
+                <w:sz w:val="22"/>
+                <w:szCs w:val="22"/>
+              </w:rPr>
+              <w:t xml:space="preserve">"Bạn muốn chạy appendix cho bảng nào? Total, Hảo Hảo, Mì Đệ Nhất... (1, vài tên, hoặc 'All')"</w:t>
+            </w:r>
+          </w:p>
+        </w:tc>
+      </w:tr>
+    </w:tbl>
+    <w:p>
+      <w:pPr>
+        <w:spacing w:after="80"/>
+      </w:pPr>
+    </w:p>
+    <w:p>
+      <w:pPr>
+        <w:spacing w:after="120"/>
+      </w:pPr>
+      <w:r>
+        <w:rPr>
+          <w:rFonts w:ascii="Arial" w:cs="Arial" w:eastAsia="Arial" w:hAnsi="Arial"/>
+          <w:sz w:val="22"/>
+          <w:szCs w:val="22"/>
+        </w:rPr>
+        <w:t xml:space="preserve">Câu trả lời được lưu lại — lần sau tự dùng lại, không hỏi lại trừ khi bạn muốn đổi.</w:t>
+      </w:r>
+    </w:p>
+    <w:p>
+      <w:pPr>
         <w:spacing w:after="160"/>
       </w:pPr>
     </w:p>
@@ -6164,6 +6371,20 @@
           </w:p>
           <w:p>
             <w:pPr>
+              <w:spacing w:after="40"/>
+            </w:pPr>
+            <w:r>
+              <w:rPr>
+                <w:rFonts w:ascii="Courier New" w:cs="Courier New" w:eastAsia="Courier New" w:hAnsi="Courier New"/>
+                <w:color w:val="333333"/>
+                <w:sz w:val="20"/>
+                <w:szCs w:val="20"/>
+              </w:rPr>
+              <w:t xml:space="preserve">tạo appendix riêng cho từng brand</w:t>
+            </w:r>
+          </w:p>
+          <w:p>
+            <w:pPr>
               <w:spacing w:after="0"/>
             </w:pPr>
             <w:r>
@@ -6798,6 +7019,62 @@
           <w:szCs w:val="22"/>
         </w:rPr>
         <w:t xml:space="preserve"> — Claude thêm sheet Sig test và chạy lại. Mặc định bảng chỉ có Count và Percentage.</w:t>
+      </w:r>
+    </w:p>
+    <w:p>
+      <w:pPr>
+        <w:spacing w:after="60" w:before="180"/>
+      </w:pPr>
+      <w:r>
+        <w:rPr>
+          <w:rFonts w:ascii="Arial" w:cs="Arial" w:eastAsia="Arial" w:hAnsi="Arial"/>
+          <w:b/>
+          <w:bCs/>
+          <w:color w:val="2E75B6"/>
+          <w:sz w:val="22"/>
+          <w:szCs w:val="22"/>
+        </w:rPr>
+        <w:t xml:space="preserve">❓  Appendix tách được theo từng brand/nhãn hàng không?</w:t>
+      </w:r>
+    </w:p>
+    <w:p>
+      <w:pPr>
+        <w:spacing w:after="100"/>
+        <w:ind w:left="360"/>
+      </w:pPr>
+      <w:r>
+        <w:rPr>
+          <w:rFonts w:ascii="Arial" w:cs="Arial" w:eastAsia="Arial" w:hAnsi="Arial"/>
+          <w:sz w:val="22"/>
+          <w:szCs w:val="22"/>
+        </w:rPr>
+        <w:t xml:space="preserve">→  </w:t>
+      </w:r>
+      <w:r>
+        <w:rPr>
+          <w:rFonts w:ascii="Arial" w:cs="Arial" w:eastAsia="Arial" w:hAnsi="Arial"/>
+          <w:sz w:val="22"/>
+          <w:szCs w:val="22"/>
+        </w:rPr>
+        <w:t xml:space="preserve">Có. Nhắn </w:t>
+      </w:r>
+      <w:r>
+        <w:rPr>
+          <w:rFonts w:ascii="Arial" w:cs="Arial" w:eastAsia="Arial" w:hAnsi="Arial"/>
+          <w:b/>
+          <w:bCs/>
+          <w:sz w:val="22"/>
+          <w:szCs w:val="22"/>
+        </w:rPr>
+        <w:t xml:space="preserve">"tạo appendix riêng cho từng brand"</w:t>
+      </w:r>
+      <w:r>
+        <w:rPr>
+          <w:rFonts w:ascii="Arial" w:cs="Arial" w:eastAsia="Arial" w:hAnsi="Arial"/>
+          <w:sz w:val="22"/>
+          <w:szCs w:val="22"/>
+        </w:rPr>
+        <w:t xml:space="preserve"> — Claude gộp tất cả brand vào 1 file PPTX, mỗi brand là 1 Section riêng trong PowerPoint để dễ nhảy nhanh giữa các brand khi review.</w:t>
       </w:r>
     </w:p>
     <w:p>

</xml_diff>